<commit_message>
Deploying to gh-pages from @ d-morrison/rme@4c6324cb97ac7f978c93e98ac831d94ed43c69b4 🚀
</commit_message>
<xml_diff>
--- a/chapters/basic-statistical-methods-handout.docx
+++ b/chapters/basic-statistical-methods-handout.docx
@@ -20171,8 +20171,19 @@
               <w:t xml:space="preserve"> </w:t>
             </w:r>
             <w:r>
-              <w:t xml:space="preserve">The comprehensive worked example below</w:t>
-            </w:r>
+              <w:t xml:space="preserve">The worked example in</w:t>
+            </w:r>
+            <w:r>
+              <w:t xml:space="preserve"> </w:t>
+            </w:r>
+            <w:hyperlink w:anchor="sec-bootstrap-hers">
+              <w:r>
+                <w:rPr>
+                  <w:rStyle w:val="Hyperlink"/>
+                </w:rPr>
+                <w:t xml:space="preserve">Section 8.4.1</w:t>
+              </w:r>
+            </w:hyperlink>
             <w:r>
               <w:t xml:space="preserve"> </w:t>
             </w:r>
@@ -20822,7 +20833,22 @@
               <w:t xml:space="preserve"> </w:t>
             </w:r>
             <w:r>
-              <w:t xml:space="preserve">All three bootstrap intervals below are consistent with the parametric CI.</w:t>
+              <w:t xml:space="preserve">All three bootstrap intervals reported by</w:t>
+            </w:r>
+            <w:r>
+              <w:t xml:space="preserve"> </w:t>
+            </w:r>
+            <w:r>
+              <w:rPr>
+                <w:rStyle w:val="VerbatimChar"/>
+              </w:rPr>
+              <w:t xml:space="preserve">boot.ci()</w:t>
+            </w:r>
+            <w:r>
+              <w:t xml:space="preserve"> </w:t>
+            </w:r>
+            <w:r>
+              <w:t xml:space="preserve">are consistent with the parametric CI.</w:t>
             </w:r>
           </w:p>
           <w:p>

</xml_diff>

<commit_message>
Deploying to gh-pages from @ d-morrison/rme@3ce3b25572250512408722d5ab112b24c4887cc4 🚀
</commit_message>
<xml_diff>
--- a/chapters/basic-statistical-methods-handout.docx
+++ b/chapters/basic-statistical-methods-handout.docx
@@ -1826,12 +1826,25 @@
                     </m:r>
                   </m:e>
                 </m:acc>
-                <m:r>
-                  <m:rPr>
-                    <m:sty m:val="p"/>
-                  </m:rPr>
-                  <m:t>=</m:t>
-                </m:r>
+                <m:limUpp>
+                  <m:e>
+                    <m:r>
+                      <m:rPr>
+                        <m:sty m:val="p"/>
+                      </m:rPr>
+                      <m:t>=</m:t>
+                    </m:r>
+                  </m:e>
+                  <m:lim>
+                    <m:r>
+                      <m:rPr>
+                        <m:nor/>
+                        <m:sty m:val="p"/>
+                      </m:rPr>
+                      <m:t>def</m:t>
+                    </m:r>
+                  </m:lim>
+                </m:limUpp>
                 <m:f>
                   <m:fPr>
                     <m:type m:val="bar"/>
@@ -1995,12 +2008,25 @@
                     </m:r>
                   </m:sup>
                 </m:sSup>
-                <m:r>
-                  <m:rPr>
-                    <m:sty m:val="p"/>
-                  </m:rPr>
-                  <m:t>=</m:t>
-                </m:r>
+                <m:limUpp>
+                  <m:e>
+                    <m:r>
+                      <m:rPr>
+                        <m:sty m:val="p"/>
+                      </m:rPr>
+                      <m:t>=</m:t>
+                    </m:r>
+                  </m:e>
+                  <m:lim>
+                    <m:r>
+                      <m:rPr>
+                        <m:nor/>
+                        <m:sty m:val="p"/>
+                      </m:rPr>
+                      <m:t>def</m:t>
+                    </m:r>
+                  </m:lim>
+                </m:limUpp>
                 <m:f>
                   <m:fPr>
                     <m:type m:val="bar"/>
@@ -2309,12 +2335,25 @@
               <m:r>
                 <m:t>s</m:t>
               </m:r>
-              <m:r>
-                <m:rPr>
-                  <m:sty m:val="p"/>
-                </m:rPr>
-                <m:t>=</m:t>
-              </m:r>
+              <m:limUpp>
+                <m:e>
+                  <m:r>
+                    <m:rPr>
+                      <m:sty m:val="p"/>
+                    </m:rPr>
+                    <m:t>=</m:t>
+                  </m:r>
+                </m:e>
+                <m:lim>
+                  <m:r>
+                    <m:rPr>
+                      <m:nor/>
+                      <m:sty m:val="p"/>
+                    </m:rPr>
+                    <m:t>def</m:t>
+                  </m:r>
+                </m:lim>
+              </m:limUpp>
               <m:rad>
                 <m:radPr>
                   <m:degHide m:val="on"/>
@@ -2759,12 +2798,25 @@
                   </m:rPr>
                   <m:t>IQR</m:t>
                 </m:r>
-                <m:r>
-                  <m:rPr>
-                    <m:sty m:val="p"/>
-                  </m:rPr>
-                  <m:t>=</m:t>
-                </m:r>
+                <m:limUpp>
+                  <m:e>
+                    <m:r>
+                      <m:rPr>
+                        <m:sty m:val="p"/>
+                      </m:rPr>
+                      <m:t>=</m:t>
+                    </m:r>
+                  </m:e>
+                  <m:lim>
+                    <m:r>
+                      <m:rPr>
+                        <m:nor/>
+                        <m:sty m:val="p"/>
+                      </m:rPr>
+                      <m:t>def</m:t>
+                    </m:r>
+                  </m:lim>
+                </m:limUpp>
                 <m:sSub>
                   <m:e>
                     <m:r>
@@ -2936,12 +2988,25 @@
                     </m:r>
                   </m:e>
                 </m:acc>
-                <m:r>
-                  <m:rPr>
-                    <m:sty m:val="p"/>
-                  </m:rPr>
-                  <m:t>=</m:t>
-                </m:r>
+                <m:limUpp>
+                  <m:e>
+                    <m:r>
+                      <m:rPr>
+                        <m:sty m:val="p"/>
+                      </m:rPr>
+                      <m:t>=</m:t>
+                    </m:r>
+                  </m:e>
+                  <m:lim>
+                    <m:r>
+                      <m:rPr>
+                        <m:nor/>
+                        <m:sty m:val="p"/>
+                      </m:rPr>
+                      <m:t>def</m:t>
+                    </m:r>
+                  </m:lim>
+                </m:limUpp>
                 <m:f>
                   <m:fPr>
                     <m:type m:val="bar"/>
@@ -8180,12 +8245,25 @@
                 <m:r>
                   <m:t>t</m:t>
                 </m:r>
-                <m:r>
-                  <m:rPr>
-                    <m:sty m:val="p"/>
-                  </m:rPr>
-                  <m:t>=</m:t>
-                </m:r>
+                <m:limUpp>
+                  <m:e>
+                    <m:r>
+                      <m:rPr>
+                        <m:sty m:val="p"/>
+                      </m:rPr>
+                      <m:t>=</m:t>
+                    </m:r>
+                  </m:e>
+                  <m:lim>
+                    <m:r>
+                      <m:rPr>
+                        <m:nor/>
+                        <m:sty m:val="p"/>
+                      </m:rPr>
+                      <m:t>def</m:t>
+                    </m:r>
+                  </m:lim>
+                </m:limUpp>
                 <m:f>
                   <m:fPr>
                     <m:type m:val="bar"/>
@@ -9350,12 +9428,25 @@
                 <m:r>
                   <m:t>t</m:t>
                 </m:r>
-                <m:r>
-                  <m:rPr>
-                    <m:sty m:val="p"/>
-                  </m:rPr>
-                  <m:t>=</m:t>
-                </m:r>
+                <m:limUpp>
+                  <m:e>
+                    <m:r>
+                      <m:rPr>
+                        <m:sty m:val="p"/>
+                      </m:rPr>
+                      <m:t>=</m:t>
+                    </m:r>
+                  </m:e>
+                  <m:lim>
+                    <m:r>
+                      <m:rPr>
+                        <m:nor/>
+                        <m:sty m:val="p"/>
+                      </m:rPr>
+                      <m:t>def</m:t>
+                    </m:r>
+                  </m:lim>
+                </m:limUpp>
                 <m:f>
                   <m:fPr>
                     <m:type m:val="bar"/>
@@ -9628,12 +9719,25 @@
                   </m:r>
                 </m:sub>
               </m:sSub>
-              <m:r>
-                <m:rPr>
-                  <m:sty m:val="p"/>
-                </m:rPr>
-                <m:t>=</m:t>
-              </m:r>
+              <m:limUpp>
+                <m:e>
+                  <m:r>
+                    <m:rPr>
+                      <m:sty m:val="p"/>
+                    </m:rPr>
+                    <m:t>=</m:t>
+                  </m:r>
+                </m:e>
+                <m:lim>
+                  <m:r>
+                    <m:rPr>
+                      <m:nor/>
+                      <m:sty m:val="p"/>
+                    </m:rPr>
+                    <m:t>def</m:t>
+                  </m:r>
+                </m:lim>
+              </m:limUpp>
               <m:sSub>
                 <m:e>
                   <m:r>
@@ -10738,12 +10842,25 @@
                 <m:r>
                   <m:t>F</m:t>
                 </m:r>
-                <m:r>
-                  <m:rPr>
-                    <m:sty m:val="p"/>
-                  </m:rPr>
-                  <m:t>=</m:t>
-                </m:r>
+                <m:limUpp>
+                  <m:e>
+                    <m:r>
+                      <m:rPr>
+                        <m:sty m:val="p"/>
+                      </m:rPr>
+                      <m:t>=</m:t>
+                    </m:r>
+                  </m:e>
+                  <m:lim>
+                    <m:r>
+                      <m:rPr>
+                        <m:nor/>
+                        <m:sty m:val="p"/>
+                      </m:rPr>
+                      <m:t>def</m:t>
+                    </m:r>
+                  </m:lim>
+                </m:limUpp>
                 <m:f>
                   <m:fPr>
                     <m:type m:val="bar"/>
@@ -13045,12 +13162,25 @@
                     </m:r>
                   </m:sup>
                 </m:sSup>
-                <m:r>
-                  <m:rPr>
-                    <m:sty m:val="p"/>
-                  </m:rPr>
-                  <m:t>=</m:t>
-                </m:r>
+                <m:limUpp>
+                  <m:e>
+                    <m:r>
+                      <m:rPr>
+                        <m:sty m:val="p"/>
+                      </m:rPr>
+                      <m:t>=</m:t>
+                    </m:r>
+                  </m:e>
+                  <m:lim>
+                    <m:r>
+                      <m:rPr>
+                        <m:nor/>
+                        <m:sty m:val="p"/>
+                      </m:rPr>
+                      <m:t>def</m:t>
+                    </m:r>
+                  </m:lim>
+                </m:limUpp>
                 <m:nary>
                   <m:naryPr>
                     <m:chr m:val="∑"/>
@@ -14124,12 +14254,25 @@
                 <m:r>
                   <m:t>r</m:t>
                 </m:r>
-                <m:r>
-                  <m:rPr>
-                    <m:sty m:val="p"/>
-                  </m:rPr>
-                  <m:t>=</m:t>
-                </m:r>
+                <m:limUpp>
+                  <m:e>
+                    <m:r>
+                      <m:rPr>
+                        <m:sty m:val="p"/>
+                      </m:rPr>
+                      <m:t>=</m:t>
+                    </m:r>
+                  </m:e>
+                  <m:lim>
+                    <m:r>
+                      <m:rPr>
+                        <m:nor/>
+                        <m:sty m:val="p"/>
+                      </m:rPr>
+                      <m:t>def</m:t>
+                    </m:r>
+                  </m:lim>
+                </m:limUpp>
                 <m:f>
                   <m:fPr>
                     <m:type m:val="bar"/>
@@ -16882,12 +17025,25 @@
                     </m:r>
                   </m:sup>
                 </m:sSup>
-                <m:r>
-                  <m:rPr>
-                    <m:sty m:val="p"/>
-                  </m:rPr>
-                  <m:t>=</m:t>
-                </m:r>
+                <m:limUpp>
+                  <m:e>
+                    <m:r>
+                      <m:rPr>
+                        <m:sty m:val="p"/>
+                      </m:rPr>
+                      <m:t>=</m:t>
+                    </m:r>
+                  </m:e>
+                  <m:lim>
+                    <m:r>
+                      <m:rPr>
+                        <m:nor/>
+                        <m:sty m:val="p"/>
+                      </m:rPr>
+                      <m:t>def</m:t>
+                    </m:r>
+                  </m:lim>
+                </m:limUpp>
                 <m:r>
                   <m:t>1</m:t>
                 </m:r>

</xml_diff>